<commit_message>
docs: corregir el texto duplicado del informe
Deja cada fila del informe con una sola frase.

Co-authored-by: javierasp04 <JavierASP04@users.noreply.github.com>
</commit_message>
<xml_diff>
--- a/docs/satet.docx
+++ b/docs/satet.docx
@@ -5,7 +5,6 @@
     <w:p>
       <w:pPr>
         <w:spacing w:after="0"/>
-        <w:jc w:val="left"/>
       </w:pPr>
       <w:r>
         <w:rPr>
@@ -42,7 +41,6 @@
       <w:tblPr>
         <w:tblStyle w:val="TableGrid"/>
         <w:tblW w:type="auto" w:w="0"/>
-        <w:tblLayout w:type="autofit"/>
         <w:tblLook w:firstColumn="1" w:firstRow="1" w:lastColumn="0" w:lastRow="0" w:noHBand="0" w:noVBand="1" w:val="04A0"/>
       </w:tblPr>
       <w:tblGrid>
@@ -59,7 +57,6 @@
             <w:pPr>
               <w:spacing w:before="40" w:after="40"/>
             </w:pPr>
-            <w:r/>
             <w:r>
               <w:rPr>
                 <w:rFonts w:ascii="Calibri" w:hAnsi="Calibri"/>
@@ -80,7 +77,6 @@
             <w:pPr>
               <w:spacing w:before="40" w:after="40"/>
             </w:pPr>
-            <w:r/>
             <w:r>
               <w:rPr>
                 <w:rFonts w:ascii="Calibri" w:hAnsi="Calibri"/>
@@ -102,7 +98,6 @@
             <w:pPr>
               <w:spacing w:before="40" w:after="40"/>
             </w:pPr>
-            <w:r/>
             <w:r>
               <w:rPr>
                 <w:rFonts w:ascii="Calibri" w:hAnsi="Calibri"/>
@@ -121,7 +116,6 @@
             <w:pPr>
               <w:spacing w:before="40" w:after="40"/>
             </w:pPr>
-            <w:r/>
             <w:r>
               <w:rPr>
                 <w:rFonts w:ascii="Calibri" w:hAnsi="Calibri"/>
@@ -143,7 +137,6 @@
             <w:pPr>
               <w:spacing w:before="40" w:after="40"/>
             </w:pPr>
-            <w:r/>
             <w:r>
               <w:rPr>
                 <w:rFonts w:ascii="Calibri" w:hAnsi="Calibri"/>
@@ -163,7 +156,6 @@
             <w:pPr>
               <w:spacing w:before="40" w:after="40"/>
             </w:pPr>
-            <w:r/>
             <w:r>
               <w:rPr>
                 <w:rFonts w:ascii="Calibri" w:hAnsi="Calibri"/>
@@ -184,7 +176,6 @@
             <w:pPr>
               <w:spacing w:before="40" w:after="40"/>
             </w:pPr>
-            <w:r/>
             <w:r>
               <w:rPr>
                 <w:rFonts w:ascii="Calibri" w:hAnsi="Calibri"/>
@@ -203,7 +194,6 @@
             <w:pPr>
               <w:spacing w:before="40" w:after="40"/>
             </w:pPr>
-            <w:r/>
             <w:r>
               <w:rPr>
                 <w:rFonts w:ascii="Calibri" w:hAnsi="Calibri"/>
@@ -225,7 +215,6 @@
             <w:pPr>
               <w:spacing w:before="40" w:after="40"/>
             </w:pPr>
-            <w:r/>
             <w:r>
               <w:rPr>
                 <w:rFonts w:ascii="Calibri" w:hAnsi="Calibri"/>
@@ -245,7 +234,6 @@
             <w:pPr>
               <w:spacing w:before="40" w:after="40"/>
             </w:pPr>
-            <w:r/>
             <w:r>
               <w:rPr>
                 <w:rFonts w:ascii="Calibri" w:hAnsi="Calibri"/>
@@ -270,7 +258,6 @@
       <w:tblPr>
         <w:tblStyle w:val="TableGrid"/>
         <w:tblW w:type="auto" w:w="0"/>
-        <w:tblLayout w:type="autofit"/>
         <w:tblLook w:firstColumn="1" w:firstRow="1" w:lastColumn="0" w:lastRow="0" w:noHBand="0" w:noVBand="1" w:val="04A0"/>
       </w:tblPr>
       <w:tblGrid>
@@ -287,7 +274,6 @@
             <w:pPr>
               <w:spacing w:before="40" w:after="40"/>
             </w:pPr>
-            <w:r/>
             <w:r>
               <w:rPr>
                 <w:rFonts w:ascii="Calibri" w:hAnsi="Calibri"/>
@@ -308,7 +294,6 @@
             <w:pPr>
               <w:spacing w:before="40" w:after="40"/>
             </w:pPr>
-            <w:r/>
             <w:r>
               <w:rPr>
                 <w:rFonts w:ascii="Calibri" w:hAnsi="Calibri"/>
@@ -330,7 +315,6 @@
             <w:pPr>
               <w:spacing w:before="40" w:after="40"/>
             </w:pPr>
-            <w:r/>
             <w:r>
               <w:rPr>
                 <w:rFonts w:ascii="Calibri" w:hAnsi="Calibri"/>
@@ -350,15 +334,12 @@
               <w:spacing w:before="40" w:after="40"/>
             </w:pPr>
             <w:r>
-              <w:t>No hay un módulo a medias. Lo que sigue son las declaraciones de minería y el 1 x 1000.</w:t>
-            </w:r>
-            <w:r>
               <w:rPr>
                 <w:rFonts w:ascii="Calibri" w:hAnsi="Calibri"/>
                 <w:b w:val="0"/>
                 <w:sz w:val="22"/>
               </w:rPr>
-              <w:t>Declaraciones de minería y el 1 x 1000. Aún no se está codificando.</w:t>
+              <w:t>No hay un módulo a medias. Lo que sigue son las declaraciones de minería y el 1 x 1000.</w:t>
             </w:r>
           </w:p>
         </w:tc>
@@ -376,7 +357,6 @@
       <w:tblPr>
         <w:tblStyle w:val="TableGrid"/>
         <w:tblW w:type="auto" w:w="0"/>
-        <w:tblLayout w:type="autofit"/>
         <w:tblLook w:firstColumn="1" w:firstRow="1" w:lastColumn="0" w:lastRow="0" w:noHBand="0" w:noVBand="1" w:val="04A0"/>
       </w:tblPr>
       <w:tblGrid>
@@ -393,7 +373,6 @@
             <w:pPr>
               <w:spacing w:before="40" w:after="40"/>
             </w:pPr>
-            <w:r/>
             <w:r>
               <w:rPr>
                 <w:rFonts w:ascii="Calibri" w:hAnsi="Calibri"/>
@@ -414,7 +393,6 @@
             <w:pPr>
               <w:spacing w:before="40" w:after="40"/>
             </w:pPr>
-            <w:r/>
             <w:r>
               <w:rPr>
                 <w:rFonts w:ascii="Calibri" w:hAnsi="Calibri"/>
@@ -436,7 +414,6 @@
             <w:pPr>
               <w:spacing w:before="40" w:after="40"/>
             </w:pPr>
-            <w:r/>
             <w:r>
               <w:rPr>
                 <w:rFonts w:ascii="Calibri" w:hAnsi="Calibri"/>
@@ -455,7 +432,6 @@
             <w:pPr>
               <w:spacing w:before="40" w:after="40"/>
             </w:pPr>
-            <w:r/>
             <w:r>
               <w:rPr>
                 <w:rFonts w:ascii="Calibri" w:hAnsi="Calibri"/>
@@ -477,7 +453,6 @@
             <w:pPr>
               <w:spacing w:before="40" w:after="40"/>
             </w:pPr>
-            <w:r/>
             <w:r>
               <w:rPr>
                 <w:rFonts w:ascii="Calibri" w:hAnsi="Calibri"/>
@@ -497,7 +472,6 @@
             <w:pPr>
               <w:spacing w:before="40" w:after="40"/>
             </w:pPr>
-            <w:r/>
             <w:r>
               <w:rPr>
                 <w:rFonts w:ascii="Calibri" w:hAnsi="Calibri"/>
@@ -518,7 +492,6 @@
             <w:pPr>
               <w:spacing w:before="40" w:after="40"/>
             </w:pPr>
-            <w:r/>
             <w:r>
               <w:rPr>
                 <w:rFonts w:ascii="Calibri" w:hAnsi="Calibri"/>
@@ -537,7 +510,6 @@
             <w:pPr>
               <w:spacing w:before="40" w:after="40"/>
             </w:pPr>
-            <w:r/>
             <w:r>
               <w:rPr>
                 <w:rFonts w:ascii="Calibri" w:hAnsi="Calibri"/>
@@ -560,15 +532,12 @@
               <w:spacing w:before="40" w:after="40"/>
             </w:pPr>
             <w:r>
-              <w:t>Reportes, POA y auditoría</w:t>
-            </w:r>
-            <w:r>
               <w:rPr>
                 <w:rFonts w:ascii="Calibri" w:hAnsi="Calibri"/>
                 <w:b/>
                 <w:sz w:val="22"/>
               </w:rPr>
-              <w:t>Reportes</w:t>
+              <w:t>Reportes, POA y auditoría</w:t>
             </w:r>
           </w:p>
         </w:tc>
@@ -582,15 +551,12 @@
               <w:spacing w:before="40" w:after="40"/>
             </w:pPr>
             <w:r>
-              <w:t>Pendiente. Las pantallas dicen próximamente.</w:t>
-            </w:r>
-            <w:r>
               <w:rPr>
                 <w:rFonts w:ascii="Calibri" w:hAnsi="Calibri"/>
                 <w:b w:val="0"/>
                 <w:sz w:val="22"/>
               </w:rPr>
-              <w:t>POA y auditoría. Las pantallas dicen próximamente.</w:t>
+              <w:t>Pendiente. Las pantallas dicen próximamente.</w:t>
             </w:r>
           </w:p>
         </w:tc>
@@ -604,7 +570,6 @@
             <w:pPr>
               <w:spacing w:before="40" w:after="40"/>
             </w:pPr>
-            <w:r/>
             <w:r>
               <w:rPr>
                 <w:rFonts w:ascii="Calibri" w:hAnsi="Calibri"/>
@@ -623,7 +588,6 @@
             <w:pPr>
               <w:spacing w:before="40" w:after="40"/>
             </w:pPr>
-            <w:r/>
             <w:r>
               <w:rPr>
                 <w:rFonts w:ascii="Calibri" w:hAnsi="Calibri"/>

</xml_diff>